<commit_message>
Deploying to gh-pages from @ Morrison-Lab/psw@7519e18af494294271d91f55a0dd9bee49c64a78 🚀
</commit_message>
<xml_diff>
--- a/index.docx
+++ b/index.docx
@@ -15,10 +15,10 @@
         <w:pStyle w:val="Date"/>
       </w:pPr>
       <w:r>
-        <w:t xml:space="preserve">Last modified: 2026-10-10 12:03:39 (PDT)</w:t>
+        <w:t xml:space="preserve">Last modified: 2026-10-10 12:11:39 (PDT)</w:t>
       </w:r>
     </w:p>
-    <w:bookmarkStart w:id="11" w:name="preface"/>
+    <w:bookmarkStart w:id="15" w:name="preface"/>
     <w:p>
       <w:pPr>
         <w:pStyle w:val="Heading1"/>
@@ -125,7 +125,82 @@
         <w:t xml:space="preserve">as a checklist for revising a draft.</w:t>
       </w:r>
     </w:p>
-    <w:bookmarkEnd w:id="11"/>
+    <w:bookmarkStart w:id="14" w:name="acknowledgments"/>
+    <w:p>
+      <w:pPr>
+        <w:pStyle w:val="Heading2"/>
+      </w:pPr>
+      <w:r>
+        <w:t xml:space="preserve">0.1 Acknowledgments</w:t>
+      </w:r>
+    </w:p>
+    <w:p>
+      <w:pPr>
+        <w:pStyle w:val="FirstParagraph"/>
+      </w:pPr>
+      <w:r>
+        <w:t xml:space="preserve">The site is built from the</w:t>
+      </w:r>
+      <w:r>
+        <w:t xml:space="preserve"> </w:t>
+      </w:r>
+      <w:hyperlink r:id="rId11">
+        <w:r>
+          <w:rPr>
+            <w:rStyle w:val="Hyperlink"/>
+          </w:rPr>
+          <w:t xml:space="preserve">qwt</w:t>
+        </w:r>
+      </w:hyperlink>
+      <w:r>
+        <w:t xml:space="preserve"> </w:t>
+      </w:r>
+      <w:r>
+        <w:t xml:space="preserve">Quarto website template,</w:t>
+      </w:r>
+      <w:r>
+        <w:t xml:space="preserve"> </w:t>
+      </w:r>
+      <w:r>
+        <w:t xml:space="preserve">whose structure comes from the</w:t>
+      </w:r>
+      <w:r>
+        <w:t xml:space="preserve"> </w:t>
+      </w:r>
+      <w:hyperlink r:id="rId12">
+        <w:r>
+          <w:rPr>
+            <w:rStyle w:val="Hyperlink"/>
+          </w:rPr>
+          <w:t xml:space="preserve">UCD-SERG lab manual</w:t>
+        </w:r>
+      </w:hyperlink>
+      <w:r>
+        <w:t xml:space="preserve">,</w:t>
+      </w:r>
+      <w:r>
+        <w:t xml:space="preserve"> </w:t>
+      </w:r>
+      <w:r>
+        <w:t xml:space="preserve">which is in turn adapted from the</w:t>
+      </w:r>
+      <w:r>
+        <w:t xml:space="preserve"> </w:t>
+      </w:r>
+      <w:hyperlink r:id="rId13">
+        <w:r>
+          <w:rPr>
+            <w:rStyle w:val="Hyperlink"/>
+          </w:rPr>
+          <w:t xml:space="preserve">Benjamin-Chung Lab Manual</w:t>
+        </w:r>
+      </w:hyperlink>
+      <w:r>
+        <w:t xml:space="preserve">.</w:t>
+      </w:r>
+    </w:p>
+    <w:bookmarkEnd w:id="14"/>
+    <w:bookmarkEnd w:id="15"/>
     <w:sectPr>
       <w:footnotePr>
         <w:numRestart w:val="eachSect"/>

</xml_diff>

<commit_message>
Deploying to gh-pages from @ Morrison-Lab/psw@4a90df8a653b7b6ec73d1ae861e8a5d7946a49c1 🚀
</commit_message>
<xml_diff>
--- a/index.docx
+++ b/index.docx
@@ -15,7 +15,7 @@
         <w:pStyle w:val="Date"/>
       </w:pPr>
       <w:r>
-        <w:t xml:space="preserve">Last modified: 2026-10-25 19:48:50 (PDT)</w:t>
+        <w:t xml:space="preserve">Last modified: 2026-10-26 00:55:25 (PDT)</w:t>
       </w:r>
     </w:p>
     <w:bookmarkStart w:id="15" w:name="preface"/>
@@ -139,12 +139,32 @@
         <w:pStyle w:val="FirstParagraph"/>
       </w:pPr>
       <w:r>
-        <w:t xml:space="preserve">The site’s structure ultimately derives from the</w:t>
+        <w:t xml:space="preserve">The site’s CI tooling was copied from the</w:t>
       </w:r>
       <w:r>
         <w:t xml:space="preserve"> </w:t>
       </w:r>
       <w:hyperlink r:id="rId11">
+        <w:r>
+          <w:rPr>
+            <w:rStyle w:val="Hyperlink"/>
+          </w:rPr>
+          <w:t xml:space="preserve">UCD-SERG lab manual</w:t>
+        </w:r>
+      </w:hyperlink>
+      <w:r>
+        <w:t xml:space="preserve">,</w:t>
+      </w:r>
+      <w:r>
+        <w:t xml:space="preserve"> </w:t>
+      </w:r>
+      <w:r>
+        <w:t xml:space="preserve">a fork of the</w:t>
+      </w:r>
+      <w:r>
+        <w:t xml:space="preserve"> </w:t>
+      </w:r>
+      <w:hyperlink r:id="rId12">
         <w:r>
           <w:rPr>
             <w:rStyle w:val="Hyperlink"/>
@@ -159,24 +179,7 @@
         <w:t xml:space="preserve"> </w:t>
       </w:r>
       <w:r>
-        <w:t xml:space="preserve">For further reading, see the</w:t>
-      </w:r>
-      <w:r>
-        <w:t xml:space="preserve"> </w:t>
-      </w:r>
-      <w:hyperlink r:id="rId12">
-        <w:r>
-          <w:rPr>
-            <w:rStyle w:val="Hyperlink"/>
-          </w:rPr>
-          <w:t xml:space="preserve">UCD-SERG lab manual</w:t>
-        </w:r>
-      </w:hyperlink>
-      <w:r>
-        <w:t xml:space="preserve"> </w:t>
-      </w:r>
-      <w:r>
-        <w:t xml:space="preserve">and the</w:t>
+        <w:t xml:space="preserve">The site is built from the</w:t>
       </w:r>
       <w:r>
         <w:t xml:space="preserve"> </w:t>

</xml_diff>

<commit_message>
Deploying to gh-pages from @ Morrison-Lab/psw@a07ca68320dc1c08f0359e7b37bae203ee03919b 🚀
</commit_message>
<xml_diff>
--- a/index.docx
+++ b/index.docx
@@ -15,10 +15,10 @@
         <w:pStyle w:val="Date"/>
       </w:pPr>
       <w:r>
-        <w:t xml:space="preserve">Last modified: 2026-10-26 01:48:18 (PDT)</w:t>
+        <w:t xml:space="preserve">Last modified: 2026-10-26 02:03:35 (PDT)</w:t>
       </w:r>
     </w:p>
-    <w:bookmarkStart w:id="14" w:name="preface"/>
+    <w:bookmarkStart w:id="11" w:name="preface"/>
     <w:p>
       <w:pPr>
         <w:pStyle w:val="Heading1"/>
@@ -125,68 +125,7 @@
         <w:t xml:space="preserve">as a checklist for revising a draft.</w:t>
       </w:r>
     </w:p>
-    <w:bookmarkStart w:id="13" w:name="acknowledgments"/>
-    <w:p>
-      <w:pPr>
-        <w:pStyle w:val="Heading2"/>
-      </w:pPr>
-      <w:r>
-        <w:t xml:space="preserve">0.1 Acknowledgments</w:t>
-      </w:r>
-    </w:p>
-    <w:p>
-      <w:pPr>
-        <w:pStyle w:val="FirstParagraph"/>
-      </w:pPr>
-      <w:r>
-        <w:t xml:space="preserve">The site’s CI tooling was written by Ezra Morrison</w:t>
-      </w:r>
-      <w:r>
-        <w:t xml:space="preserve"> </w:t>
-      </w:r>
-      <w:r>
-        <w:t xml:space="preserve">for the</w:t>
-      </w:r>
-      <w:r>
-        <w:t xml:space="preserve"> </w:t>
-      </w:r>
-      <w:hyperlink r:id="rId11">
-        <w:r>
-          <w:rPr>
-            <w:rStyle w:val="Hyperlink"/>
-          </w:rPr>
-          <w:t xml:space="preserve">UCD-SERG lab manual</w:t>
-        </w:r>
-      </w:hyperlink>
-      <w:r>
-        <w:t xml:space="preserve">.</w:t>
-      </w:r>
-      <w:r>
-        <w:t xml:space="preserve"> </w:t>
-      </w:r>
-      <w:r>
-        <w:t xml:space="preserve">The site is built from the</w:t>
-      </w:r>
-      <w:r>
-        <w:t xml:space="preserve"> </w:t>
-      </w:r>
-      <w:hyperlink r:id="rId12">
-        <w:r>
-          <w:rPr>
-            <w:rStyle w:val="Hyperlink"/>
-          </w:rPr>
-          <w:t xml:space="preserve">qwt</w:t>
-        </w:r>
-      </w:hyperlink>
-      <w:r>
-        <w:t xml:space="preserve"> </w:t>
-      </w:r>
-      <w:r>
-        <w:t xml:space="preserve">website template.</w:t>
-      </w:r>
-    </w:p>
-    <w:bookmarkEnd w:id="13"/>
-    <w:bookmarkEnd w:id="14"/>
+    <w:bookmarkEnd w:id="11"/>
     <w:sectPr>
       <w:footnotePr>
         <w:numRestart w:val="eachSect"/>

</xml_diff>